<commit_message>
docs: sync html/pdf exports for v1.0.37 release finalization (post-tag doc sync)
Signed-off-by: Милош Васић <milos85vasic@gmail.com>
</commit_message>
<xml_diff>
--- a/CHANGELOG.docx
+++ b/CHANGELOG.docx
@@ -60,13 +60,13 @@
         </w:pict>
       </w:r>
     </w:p>
-    <w:bookmarkStart w:id="12" w:name="Xf4d189c928ccad052b19b4e78e12e5c76f372bc"/>
+    <w:bookmarkStart w:id="12" w:name="v1037--2026-07-23"/>
     <w:p>
       <w:pPr>
         <w:pStyle w:val="Heading2"/>
       </w:pPr>
       <w:r>
-        <w:t xml:space="preserve">[v1.0.37] — 2026-07-22 (prepared; release tag pending operator gate)</w:t>
+        <w:t xml:space="preserve">[v1.0.37] — 2026-07-23</w:t>
       </w:r>
     </w:p>
     <w:bookmarkStart w:id="10" w:name="fixed"/>

</xml_diff>